<commit_message>
reduced spacing of page
</commit_message>
<xml_diff>
--- a/Assignment 3B_Project process book/Assignment 3B - Project process book.docx
+++ b/Assignment 3B_Project process book/Assignment 3B - Project process book.docx
@@ -1830,14 +1830,13 @@
     <w:p/>
     <w:p/>
     <w:p/>
-    <w:p/>
-    <w:p/>
     <w:p>
       <w:pPr>
         <w:pStyle w:val="Heading2"/>
       </w:pPr>
       <w:bookmarkStart w:id="3" w:name="_Toc239535711"/>
       <w:r>
+        <w:lastRenderedPageBreak/>
         <w:t>1.3 Project Schedule</w:t>
       </w:r>
       <w:bookmarkEnd w:id="3"/>
@@ -2476,7 +2475,6 @@
               <w:contextualSpacing w:val="0"/>
             </w:pPr>
             <w:r>
-              <w:lastRenderedPageBreak/>
               <w:t>Finalise website design.</w:t>
             </w:r>
           </w:p>
@@ -2522,6 +2520,7 @@
               <w:spacing w:before="120" w:after="120"/>
             </w:pPr>
             <w:r>
+              <w:lastRenderedPageBreak/>
               <w:t>Week 10</w:t>
             </w:r>
           </w:p>
@@ -6745,6 +6744,7 @@
   <w:style w:type="character" w:default="1" w:styleId="DefaultParagraphFont">
     <w:name w:val="Default Paragraph Font"/>
     <w:uiPriority w:val="1"/>
+    <w:semiHidden/>
     <w:unhideWhenUsed/>
   </w:style>
   <w:style w:type="table" w:default="1" w:styleId="TableNormal">

</xml_diff>